<commit_message>
Fix Table C2: add missing Eritrea row in both EN and JP manuscripts
Devin Review correctly identified that Eritrea (MAPE 37.9%) was discussed
in the text but missing from Table C2. Added Eritrea row and increased
table rows from 14 to 15 in both make_pdr_en.py and make_pdr_jp.py.

Co-Authored-By: Tatsuki Onishi <bougtoir@gmail.com>
</commit_message>
<xml_diff>
--- a/tempo-effect-paper/manuscripts/PDR_Research_Note_EN.docx
+++ b/tempo-effect-paper/manuscripts/PDR_Research_Note_EN.docx
@@ -3575,6 +3575,48 @@
           </w:p>
         </w:tc>
       </w:tr>
+      <w:tr>
+        <w:tc>
+          <w:tcPr>
+            <w:tcW w:type="dxa" w:w="2340"/>
+          </w:tcPr>
+          <w:p>
+            <w:r>
+              <w:t>Eritrea</w:t>
+            </w:r>
+          </w:p>
+        </w:tc>
+        <w:tc>
+          <w:tcPr>
+            <w:tcW w:type="dxa" w:w="2340"/>
+          </w:tcPr>
+          <w:p>
+            <w:r>
+              <w:t>Eritrean indep. (1993)</w:t>
+            </w:r>
+          </w:p>
+        </w:tc>
+        <w:tc>
+          <w:tcPr>
+            <w:tcW w:type="dxa" w:w="2340"/>
+          </w:tcPr>
+          <w:p>
+            <w:r>
+              <w:t>37.9</w:t>
+            </w:r>
+          </w:p>
+        </w:tc>
+        <w:tc>
+          <w:tcPr>
+            <w:tcW w:type="dxa" w:w="2340"/>
+          </w:tcPr>
+          <w:p>
+            <w:r>
+              <w:t>Conflict, conscription, emigration</w:t>
+            </w:r>
+          </w:p>
+        </w:tc>
+      </w:tr>
     </w:tbl>
     <w:p>
       <w:pPr>

</xml_diff>

<commit_message>
Fix Baltic states scale bug and figure title overlap
1. Changed Baltic predecessor_code from 'RUS' (~130M Russia) to 'SUN'
   (non-existent USSR code) to skip invalid pre-split comparison.
   Baltic total (~7M) vs Russia (~130M) was a meaningless comparison.
2. Fixed suptitle/panel title overlap in fig_natural_experiments_summary
   by using fig.tight_layout(rect=[0, 0, 1, 0.93]) for proper spacing.

Co-Authored-By: Tatsuki Onishi <bougtoir@gmail.com>
</commit_message>
<xml_diff>
--- a/tempo-effect-paper/manuscripts/PDR_Research_Note_EN.docx
+++ b/tempo-effect-paper/manuscripts/PDR_Research_Note_EN.docx
@@ -2906,7 +2906,7 @@
       <w:r>
         <w:drawing>
           <wp:inline xmlns:a="http://schemas.openxmlformats.org/drawingml/2006/main" xmlns:pic="http://schemas.openxmlformats.org/drawingml/2006/picture">
-            <wp:extent cx="5943600" cy="3742144"/>
+            <wp:extent cx="5943600" cy="3596044"/>
             <wp:docPr id="7" name="Picture 7"/>
             <wp:cNvGraphicFramePr>
               <a:graphicFrameLocks noChangeAspect="1"/>
@@ -2927,7 +2927,7 @@
                   <pic:spPr>
                     <a:xfrm>
                       <a:off x="0" y="0"/>
-                      <a:ext cx="5943600" cy="3742144"/>
+                      <a:ext cx="5943600" cy="3596044"/>
                     </a:xfrm>
                     <a:prstGeom prst="rect"/>
                   </pic:spPr>

</xml_diff>

<commit_message>
Fix y-axis to start at 0 for main analysis figures (fig1, fig2)
Co-Authored-By: Tatsuki Onishi <bougtoir@gmail.com>
</commit_message>
<xml_diff>
--- a/tempo-effect-paper/manuscripts/PDR_Research_Note_EN.docx
+++ b/tempo-effect-paper/manuscripts/PDR_Research_Note_EN.docx
@@ -773,7 +773,7 @@
       <w:r>
         <w:drawing>
           <wp:inline xmlns:a="http://schemas.openxmlformats.org/drawingml/2006/main" xmlns:pic="http://schemas.openxmlformats.org/drawingml/2006/picture">
-            <wp:extent cx="5943600" cy="7537448"/>
+            <wp:extent cx="5943600" cy="7534925"/>
             <wp:docPr id="2" name="Picture 2"/>
             <wp:cNvGraphicFramePr>
               <a:graphicFrameLocks noChangeAspect="1"/>
@@ -794,7 +794,7 @@
                   <pic:spPr>
                     <a:xfrm>
                       <a:off x="0" y="0"/>
-                      <a:ext cx="5943600" cy="7537448"/>
+                      <a:ext cx="5943600" cy="7534925"/>
                     </a:xfrm>
                     <a:prstGeom prst="rect"/>
                   </pic:spPr>

</xml_diff>

<commit_message>
Fix fig1/fig2 suptitle placement above panel titles with proper spacing
Co-Authored-By: Tatsuki Onishi <bougtoir@gmail.com>
</commit_message>
<xml_diff>
--- a/tempo-effect-paper/manuscripts/PDR_Research_Note_EN.docx
+++ b/tempo-effect-paper/manuscripts/PDR_Research_Note_EN.docx
@@ -721,7 +721,7 @@
       <w:r>
         <w:drawing>
           <wp:inline xmlns:a="http://schemas.openxmlformats.org/drawingml/2006/main" xmlns:pic="http://schemas.openxmlformats.org/drawingml/2006/picture">
-            <wp:extent cx="5486400" cy="3015067"/>
+            <wp:extent cx="5486400" cy="3045729"/>
             <wp:docPr id="1" name="Picture 1"/>
             <wp:cNvGraphicFramePr>
               <a:graphicFrameLocks noChangeAspect="1"/>
@@ -742,7 +742,7 @@
                   <pic:spPr>
                     <a:xfrm>
                       <a:off x="0" y="0"/>
-                      <a:ext cx="5486400" cy="3015067"/>
+                      <a:ext cx="5486400" cy="3045729"/>
                     </a:xfrm>
                     <a:prstGeom prst="rect"/>
                   </pic:spPr>
@@ -773,7 +773,7 @@
       <w:r>
         <w:drawing>
           <wp:inline xmlns:a="http://schemas.openxmlformats.org/drawingml/2006/main" xmlns:pic="http://schemas.openxmlformats.org/drawingml/2006/picture">
-            <wp:extent cx="5943600" cy="7534925"/>
+            <wp:extent cx="5943600" cy="7612502"/>
             <wp:docPr id="2" name="Picture 2"/>
             <wp:cNvGraphicFramePr>
               <a:graphicFrameLocks noChangeAspect="1"/>
@@ -794,7 +794,7 @@
                   <pic:spPr>
                     <a:xfrm>
                       <a:off x="0" y="0"/>
-                      <a:ext cx="5943600" cy="7534925"/>
+                      <a:ext cx="5943600" cy="7612502"/>
                     </a:xfrm>
                     <a:prstGeom prst="rect"/>
                   </pic:spPr>

</xml_diff>

<commit_message>
Fix Devin Review bugs: cover letter table count and decade parameter off-by-one
- Fix cover letter: '3 tables' -> '4 tables' (Table 1, B1, C1, C2)
- Fix natural_experiments.py: decade parameter selection >= -> > to match main model
- Update all hardcoded MAPE values in EN/JP manuscripts to match new output
- Update Table C1 deviation percentages (1990: -3.6%, 2010: -9.9%, 2020: -14.6%, 2023: -15.8%)
- Update Table C2 with corrected MAPE values for all 14 natural experiment cases
- Regenerate all figures, cover letter, and manuscripts

Co-Authored-By: Tatsuki Onishi <bougtoir@gmail.com>
</commit_message>
<xml_diff>
--- a/tempo-effect-paper/manuscripts/PDR_Research_Note_EN.docx
+++ b/tempo-effect-paper/manuscripts/PDR_Research_Note_EN.docx
@@ -2552,7 +2552,7 @@
           </w:tcPr>
           <w:p>
             <w:r>
-              <w:t>−3.7</w:t>
+              <w:t>−3.6</w:t>
             </w:r>
           </w:p>
         </w:tc>
@@ -2616,7 +2616,7 @@
           </w:tcPr>
           <w:p>
             <w:r>
-              <w:t>73.6</w:t>
+              <w:t>73.7</w:t>
             </w:r>
           </w:p>
         </w:tc>
@@ -2636,7 +2636,7 @@
           </w:tcPr>
           <w:p>
             <w:r>
-              <w:t>−10.0</w:t>
+              <w:t>−9.9</w:t>
             </w:r>
           </w:p>
         </w:tc>
@@ -2658,7 +2658,7 @@
           </w:tcPr>
           <w:p>
             <w:r>
-              <w:t>70.8</w:t>
+              <w:t>71.0</w:t>
             </w:r>
           </w:p>
         </w:tc>
@@ -2678,7 +2678,7 @@
           </w:tcPr>
           <w:p>
             <w:r>
-              <w:t>−14.9</w:t>
+              <w:t>−14.6</w:t>
             </w:r>
           </w:p>
         </w:tc>
@@ -2700,7 +2700,7 @@
           </w:tcPr>
           <w:p>
             <w:r>
-              <w:t>69.8</w:t>
+              <w:t>70.1</w:t>
             </w:r>
           </w:p>
         </w:tc>
@@ -2720,7 +2720,7 @@
           </w:tcPr>
           <w:p>
             <w:r>
-              <w:t>−16.2</w:t>
+              <w:t>−15.8</w:t>
             </w:r>
           </w:p>
         </w:tc>
@@ -2748,7 +2748,7 @@
           <w:i w:val="0"/>
           <w:sz w:val="22"/>
         </w:rPr>
-        <w:t>The synthetic trajectory underestimates observed population by 3.7% at reunification (1990), growing to 16.2% by 2023. This widening gap reflects three compounding processes absent from the closed model: (a) net immigration to unified Germany averaging ~300,000–400,000 persons per year; (b) internal East-to-West migration altering regional demographic dynamics; and (c) convergence of East German fertility and mortality toward Western levels, which our separate-regime model does not capture post-1990. The overall MAPE of 6.6% for the synthetic East+West model confirms that Germany’s relatively poor fit in the main analysis (Table 1) is attributable primarily to reunification’s migration effects rather than to structural model failure.</w:t>
+        <w:t>The synthetic trajectory underestimates observed population by 3.6% at reunification (1990), growing to 15.8% by 2023. This widening gap reflects three compounding processes absent from the closed model: (a) net immigration to unified Germany averaging ~300,000–400,000 persons per year; (b) internal East-to-West migration altering regional demographic dynamics; and (c) convergence of East German fertility and mortality toward Western levels, which our separate-regime model does not capture post-1990. The overall MAPE of 6.4% for the synthetic East+West model confirms that Germany’s relatively poor fit in the main analysis (Table 1) is attributable primarily to reunification’s migration effects rather than to structural model failure.</w:t>
       </w:r>
     </w:p>
     <w:p>
@@ -2824,7 +2824,7 @@
           <w:i w:val="0"/>
           <w:sz w:val="22"/>
         </w:rPr>
-        <w:t>The peaceful dissolution of Czechoslovakia on 1 January 1993 created two independent states—Czechia and Slovakia—with relatively limited cross-border migration. This case represents a relatively clean natural experiment: a state partition with minimal population redistribution. Our model achieves MAPE of 6.3% for Czechia and 10.1% for Slovakia over the full 1970–2023 period. Slovakia’s higher error reflects emigration to Czechia and Western Europe following EU accession (2004), which the closed model cannot capture.</w:t>
+        <w:t>The peaceful dissolution of Czechoslovakia on 1 January 1993 created two independent states—Czechia and Slovakia—with relatively limited cross-border migration. This case represents a relatively clean natural experiment: a state partition with minimal population redistribution. Our model achieves MAPE of 6.3% for Czechia and 9.9% for Slovakia over the full 1970–2023 period. Slovakia’s higher error reflects emigration to Czechia and Western Europe following EU accession (2004), which the closed model cannot capture.</w:t>
       </w:r>
     </w:p>
     <w:p>
@@ -2848,7 +2848,7 @@
           <w:i w:val="0"/>
           <w:sz w:val="22"/>
         </w:rPr>
-        <w:t>The breakup of Yugoslavia involved armed conflict, ethnic cleansing, and massive refugee flows affecting all successor states. This represents the most extreme migration shock in our sample. Model performance varies substantially across successors: Croatia (MAPE 4.1%) and North Macedonia (6.1%) show reasonable fit, reflecting relatively stable post-conflict demographics. Bosnia and Herzegovina (7.7%) and Slovenia (12.3%) show larger errors—Bosnia due to war-related population loss and displacement, Slovenia due to immigration-driven growth as a small EU member state. Serbia (7.2%) and Montenegro (8.4%) fall in between. The range of model performance across Yugoslav successor states illustrates how conflict-driven migration creates heterogeneous deviations from the endogenous renewal baseline.</w:t>
+        <w:t>The breakup of Yugoslavia involved armed conflict, ethnic cleansing, and massive refugee flows affecting all successor states. This represents the most extreme migration shock in our sample. Model performance varies substantially across successors: Croatia (MAPE 4.1%) and North Macedonia (6.4%) show reasonable fit, reflecting relatively stable post-conflict demographics. Bosnia and Herzegovina (8.1%) and Slovenia (12.2%) show larger errors—Bosnia due to war-related population loss and displacement, Slovenia due to immigration-driven growth as a small EU member state. Serbia (7.1%) and Montenegro (8.1%) fall in between. The range of model performance across Yugoslav successor states illustrates how conflict-driven migration creates heterogeneous deviations from the endogenous renewal baseline.</w:t>
       </w:r>
     </w:p>
     <w:p>
@@ -2872,7 +2872,7 @@
           <w:i w:val="0"/>
           <w:sz w:val="22"/>
         </w:rPr>
-        <w:t>Estonia, Latvia, and Lithuania gained independence in 1991 from the Soviet Union, followed by significant emigration of ethnic Russians and outmigration to Western Europe (especially after EU accession in 2004). Model MAPE ranges from 4.9% (Estonia) to 7.1% (Lithuania), reflecting the persistent emigration that the closed model does not account for. These cases demonstrate that even moderate but sustained net emigration (≈0.5–1.0% of population annually) accumulates over three decades to produce substantial model-observation divergence.</w:t>
+        <w:t>Estonia, Latvia, and Lithuania gained independence in 1991 from the Soviet Union, followed by significant emigration of ethnic Russians and outmigration to Western Europe (especially after EU accession in 2004). Model MAPE ranges from 4.8% (Estonia) to 7.1% (Lithuania), reflecting the persistent emigration that the closed model does not account for. These cases demonstrate that even moderate but sustained net emigration (≈0.5–1.0% of population annually) accumulates over three decades to produce substantial model-observation divergence.</w:t>
       </w:r>
     </w:p>
     <w:p>
@@ -2896,7 +2896,7 @@
           <w:i w:val="0"/>
           <w:sz w:val="22"/>
         </w:rPr>
-        <w:t>Eritrean independence (1993) separated two populations in the midst of high-fertility demographic transition. Model performance differs markedly: Ethiopia (MAPE 16.7%) shows substantial overprojection, reflecting within-decade fertility decline faster than captured by decadal parameter updates. Eritrea (MAPE 37.9%) shows the largest error in our natural experiments sample, driven by prolonged military conscription, conflict-related emigration, and highly uncertain baseline demographic data. These cases highlight the model’s limitations in conflict-affected, data-sparse settings where rapid demographic change co-occurs with large-scale displacement.</w:t>
+        <w:t>Eritrean independence (1993) separated two populations in the midst of high-fertility demographic transition. Model performance differs markedly: Ethiopia (MAPE 16.5%) shows substantial overprojection, reflecting within-decade fertility decline faster than captured by decadal parameter updates. Eritrea (MAPE 37.8%) shows the largest error in our natural experiments sample, driven by prolonged military conscription, conflict-related emigration, and highly uncertain baseline demographic data. These cases highlight the model’s limitations in conflict-affected, data-sparse settings where rapid demographic change co-occurs with large-scale displacement.</w:t>
       </w:r>
     </w:p>
     <w:p>
@@ -3056,7 +3056,7 @@
           </w:tcPr>
           <w:p>
             <w:r>
-              <w:t>6.6</w:t>
+              <w:t>6.4</w:t>
             </w:r>
           </w:p>
         </w:tc>
@@ -3140,7 +3140,7 @@
           </w:tcPr>
           <w:p>
             <w:r>
-              <w:t>10.1</w:t>
+              <w:t>9.9</w:t>
             </w:r>
           </w:p>
         </w:tc>
@@ -3224,7 +3224,7 @@
           </w:tcPr>
           <w:p>
             <w:r>
-              <w:t>12.3</w:t>
+              <w:t>12.2</w:t>
             </w:r>
           </w:p>
         </w:tc>
@@ -3266,7 +3266,7 @@
           </w:tcPr>
           <w:p>
             <w:r>
-              <w:t>7.7</w:t>
+              <w:t>8.1</w:t>
             </w:r>
           </w:p>
         </w:tc>
@@ -3308,7 +3308,7 @@
           </w:tcPr>
           <w:p>
             <w:r>
-              <w:t>7.2</w:t>
+              <w:t>7.1</w:t>
             </w:r>
           </w:p>
         </w:tc>
@@ -3350,7 +3350,7 @@
           </w:tcPr>
           <w:p>
             <w:r>
-              <w:t>6.1</w:t>
+              <w:t>6.4</w:t>
             </w:r>
           </w:p>
         </w:tc>
@@ -3392,7 +3392,7 @@
           </w:tcPr>
           <w:p>
             <w:r>
-              <w:t>8.4</w:t>
+              <w:t>8.1</w:t>
             </w:r>
           </w:p>
         </w:tc>
@@ -3434,7 +3434,7 @@
           </w:tcPr>
           <w:p>
             <w:r>
-              <w:t>4.9</w:t>
+              <w:t>4.8</w:t>
             </w:r>
           </w:p>
         </w:tc>
@@ -3560,7 +3560,7 @@
           </w:tcPr>
           <w:p>
             <w:r>
-              <w:t>16.7</w:t>
+              <w:t>16.5</w:t>
             </w:r>
           </w:p>
         </w:tc>
@@ -3602,7 +3602,7 @@
           </w:tcPr>
           <w:p>
             <w:r>
-              <w:t>37.9</w:t>
+              <w:t>37.8</w:t>
             </w:r>
           </w:p>
         </w:tc>
@@ -3653,13 +3653,13 @@
           <w:i w:val="0"/>
           <w:sz w:val="22"/>
         </w:rPr>
-        <w:t>First, the model performs reasonably well (MAPE &lt; 8%) even for countries that experienced major political upheaval, provided that post-event migration was moderate and demographic data are reliable. Croatia (4.1%), Estonia (4.9%), and Czechia (6.3%) all fall within this range, demonstrating that the quantum–tempo–survival mechanism captures the bulk of population dynamics even in contexts of political discontinuity.</w:t>
+        <w:t>First, the model performs reasonably well (MAPE &lt; 8%) even for countries that experienced major political upheaval, provided that post-event migration was moderate and demographic data are reliable. Croatia (4.1%), Estonia (4.8%), and Czechia (6.3%) all fall within this range, demonstrating that the quantum–tempo–survival mechanism captures the bulk of population dynamics even in contexts of political discontinuity.</w:t>
         <w:br/>
         <w:br/>
-        <w:t>Second, the magnitude of model-observation divergence provides a direct estimate of the migration component. Germany’s 16.2% synthetic-observed gap by 2023 implies that immigration added approximately 13.5 million persons—equivalent to one-sixth of the total population—beyond what natural increase alone would have produced. This quantification is only possible because the closed model isolates natural demographic dynamics.</w:t>
+        <w:t>Second, the magnitude of model-observation divergence provides a direct estimate of the migration component. Germany’s 15.8% synthetic-observed gap by 2023 implies that immigration added approximately 13.5 million persons—equivalent to one-sixth of the total population—beyond what natural increase alone would have produced. This quantification is only possible because the closed model isolates natural demographic dynamics.</w:t>
         <w:br/>
         <w:br/>
-        <w:t>Third, the model’s limitations are most acute in conflict-affected, data-sparse settings (Eritrea: 37.9%) and where sustained emigration removes a large fraction of the population (Slovenia: 12.3%, Slovakia: 10.1%). These cases identify the boundary conditions for the endogenous renewal framework and reinforce the importance of migration modelling for countries experiencing sustained population flows.</w:t>
+        <w:t>Third, the model’s limitations are most acute in conflict-affected, data-sparse settings (Eritrea: 37.8%) and where sustained emigration removes a large fraction of the population (Slovenia: 12.2%, Slovakia: 9.9%). These cases identify the boundary conditions for the endogenous renewal framework and reinforce the importance of migration modelling for countries experiencing sustained population flows.</w:t>
       </w:r>
     </w:p>
     <w:p>

</xml_diff>